<commit_message>
Oferta: podgląd przed pobraniem Worda, logo bez fetch, H1/H2 bez pogrubionej cyfry
Opcja 2500 kg domyślnie wyłączona; zmiana zysku nie zwija sekcji formularza.

Co-Authored-By: Claude Opus 5.5 <noreply@anthropic.com>
Claude-Session: https://claude.ai/code/session_01XygCrjT9K7zVw2zg8hs3qQ
</commit_message>
<xml_diff>
--- a/kalkulator-nk38/przyklady/Oferta_ul_Brzozowa_9_Poznan_NK38.docx
+++ b/kalkulator-nk38/przyklady/Oferta_ul_Brzozowa_9_Poznan_NK38.docx
@@ -12,7 +12,7 @@
           <w:szCs w:val="16"/>
           <w:rFonts w:ascii="Verdana" w:cs="Verdana" w:eastAsia="Verdana" w:hAnsi="Verdana"/>
         </w:rPr>
-        <w:t xml:space="preserve">Kraków, dnia 27.10.2026r.</w:t>
+        <w:t xml:space="preserve">Kraków, dnia 30.10.2026r.</w:t>
       </w:r>
     </w:p>
     <w:p>
@@ -412,35 +412,35 @@
           <w:szCs w:val="16"/>
           <w:rFonts w:ascii="Verdana" w:cs="Verdana" w:eastAsia="Verdana" w:hAnsi="Verdana"/>
         </w:rPr>
-        <w:t xml:space="preserve"> wysokość H</w:t>
-      </w:r>
-      <w:r>
-        <w:rPr>
-          <w:b/>
-          <w:bCs/>
-          <w:sz w:val="16"/>
-          <w:szCs w:val="16"/>
-          <w:rFonts w:ascii="Verdana" w:cs="Verdana" w:eastAsia="Verdana" w:hAnsi="Verdana"/>
-        </w:rPr>
-        <w:t xml:space="preserve">1-190,</w:t>
-      </w:r>
-      <w:r>
-        <w:rPr>
-          <w:sz w:val="16"/>
-          <w:szCs w:val="16"/>
-          <w:rFonts w:ascii="Verdana" w:cs="Verdana" w:eastAsia="Verdana" w:hAnsi="Verdana"/>
-        </w:rPr>
-        <w:t xml:space="preserve"> H</w:t>
-      </w:r>
-      <w:r>
-        <w:rPr>
-          <w:b/>
-          <w:bCs/>
-          <w:sz w:val="16"/>
-          <w:szCs w:val="16"/>
-          <w:rFonts w:ascii="Verdana" w:cs="Verdana" w:eastAsia="Verdana" w:hAnsi="Verdana"/>
-        </w:rPr>
-        <w:t xml:space="preserve">2-195</w:t>
+        <w:t xml:space="preserve"> wysokość H1-</w:t>
+      </w:r>
+      <w:r>
+        <w:rPr>
+          <w:b/>
+          <w:bCs/>
+          <w:sz w:val="16"/>
+          <w:szCs w:val="16"/>
+          <w:rFonts w:ascii="Verdana" w:cs="Verdana" w:eastAsia="Verdana" w:hAnsi="Verdana"/>
+        </w:rPr>
+        <w:t xml:space="preserve">190,</w:t>
+      </w:r>
+      <w:r>
+        <w:rPr>
+          <w:sz w:val="16"/>
+          <w:szCs w:val="16"/>
+          <w:rFonts w:ascii="Verdana" w:cs="Verdana" w:eastAsia="Verdana" w:hAnsi="Verdana"/>
+        </w:rPr>
+        <w:t xml:space="preserve"> H2-</w:t>
+      </w:r>
+      <w:r>
+        <w:rPr>
+          <w:b/>
+          <w:bCs/>
+          <w:sz w:val="16"/>
+          <w:szCs w:val="16"/>
+          <w:rFonts w:ascii="Verdana" w:cs="Verdana" w:eastAsia="Verdana" w:hAnsi="Verdana"/>
+        </w:rPr>
+        <w:t xml:space="preserve">195</w:t>
       </w:r>
       <w:r>
         <w:rPr>

</xml_diff>

<commit_message>
Opis wariantu: ręczna zmiana fragmentu nie wyłącza automatyki reszty; nagłówki oferty z następnym akapitem
Co-Authored-By: Claude Sonnet 5.5 <noreply@anthropic.com>
Claude-Session: https://claude.ai/code/session_01XygCrjT9K7zVw2zg8hs3qQ
</commit_message>
<xml_diff>
--- a/kalkulator-nk38/przyklady/Oferta_ul_Brzozowa_9_Poznan_NK38.docx
+++ b/kalkulator-nk38/przyklady/Oferta_ul_Brzozowa_9_Poznan_NK38.docx
@@ -297,6 +297,7 @@
     </w:p>
     <w:p>
       <w:pPr>
+        <w:keepNext/>
         <w:tabs>
           <w:tab w:val="left" w:pos="284"/>
         </w:tabs>
@@ -1498,6 +1499,7 @@
     </w:p>
     <w:p>
       <w:pPr>
+        <w:keepNext/>
         <w:tabs>
           <w:tab w:val="left" w:pos="284"/>
         </w:tabs>
@@ -1560,6 +1562,7 @@
     </w:p>
     <w:p>
       <w:pPr>
+        <w:keepNext/>
         <w:tabs>
           <w:tab w:val="left" w:pos="284"/>
         </w:tabs>
@@ -1631,6 +1634,7 @@
     </w:p>
     <w:p>
       <w:pPr>
+        <w:keepNext/>
         <w:tabs>
           <w:tab w:val="left" w:pos="284"/>
         </w:tabs>
@@ -1863,6 +1867,7 @@
     </w:p>
     <w:p>
       <w:pPr>
+        <w:keepNext/>
         <w:tabs>
           <w:tab w:val="left" w:pos="284"/>
         </w:tabs>

</xml_diff>